<commit_message>
feat(ks3): compile great_war_part2 into 20-page universal KS3 engine with capstone spread & living timeline
</commit_message>
<xml_diff>
--- a/public/docs/History_Curriculum_Master_Roadmap_16_Units.docx
+++ b/public/docs/History_Curriculum_Master_Roadmap_16_Units.docx
@@ -3245,7 +3245,7 @@
                 <w:sz w:val="17"/>
                 <w:szCs w:val="17"/>
               </w:rPr>
-              <w:t xml:space="preserve">The Great War: Western Front &amp; Aftermath
+              <w:t xml:space="preserve">The Great War: Western Front &amp; Aftermath (1914–1919)
 (great_war_part2)</w:t>
             </w:r>
           </w:p>
@@ -3314,7 +3314,7 @@
                 <w:sz w:val="17"/>
                 <w:szCs w:val="17"/>
               </w:rPr>
-              <w:t xml:space="preserve">Complete (9 Lessons Authored)</w:t>
+              <w:t xml:space="preserve">Complete (7 In-Depth Enquiries)</w:t>
             </w:r>
           </w:p>
         </w:tc>
@@ -3348,7 +3348,7 @@
                 <w:sz w:val="17"/>
                 <w:szCs w:val="17"/>
               </w:rPr>
-              <w:t xml:space="preserve">Amber (Draft companion textbook)</w:t>
+              <w:t xml:space="preserve">Gold (17p Companion Textbook)</w:t>
             </w:r>
           </w:p>
         </w:tc>
@@ -3382,88 +3382,88 @@
                 <w:sz w:val="17"/>
                 <w:szCs w:val="17"/>
               </w:rPr>
-              <w:t xml:space="preserve">Amber (Pending 20p Universal Engine compile)</w:t>
-            </w:r>
-          </w:p>
-        </w:tc>
-        <w:tc>
-          <w:tcPr>
-            <w:tcW w:type="pct" w:w="9%"/>
-            <w:tcBorders>
-              <w:top w:val="single" w:color="CBD5E1" w:sz="4"/>
-              <w:left w:val="single" w:color="CBD5E1" w:sz="4"/>
-              <w:bottom w:val="single" w:color="CBD5E1" w:sz="4"/>
-              <w:right w:val="single" w:color="CBD5E1" w:sz="4"/>
-            </w:tcBorders>
-            <w:shd w:fill="F8FAFC"/>
-            <w:tcMar>
-              <w:top w:type="dxa" w:w="140"/>
-              <w:left w:type="dxa" w:w="140"/>
-              <w:bottom w:type="dxa" w:w="140"/>
-              <w:right w:type="dxa" w:w="140"/>
-            </w:tcMar>
-          </w:tcPr>
-          <w:p>
-            <w:pPr>
-              <w:jc w:val="center"/>
-            </w:pPr>
-            <w:r>
-              <w:rPr>
-                <w:rFonts w:ascii="Segoe UI" w:cs="Segoe UI" w:eastAsia="Segoe UI" w:hAnsi="Segoe UI"/>
-                <w:b w:val="false"/>
-                <w:bCs w:val="false"/>
-                <w:color w:val="0F172A"/>
-                <w:sz w:val="17"/>
-                <w:szCs w:val="17"/>
-              </w:rPr>
-              <w:t xml:space="preserve">Pending (Needs unit-specific strands)</w:t>
-            </w:r>
-          </w:p>
-        </w:tc>
-        <w:tc>
-          <w:tcPr>
-            <w:tcW w:type="pct" w:w="9%"/>
-            <w:tcBorders>
-              <w:top w:val="single" w:color="CBD5E1" w:sz="4"/>
-              <w:left w:val="single" w:color="CBD5E1" w:sz="4"/>
-              <w:bottom w:val="single" w:color="CBD5E1" w:sz="4"/>
-              <w:right w:val="single" w:color="CBD5E1" w:sz="4"/>
-            </w:tcBorders>
-            <w:shd w:fill="F8FAFC"/>
-            <w:tcMar>
-              <w:top w:type="dxa" w:w="140"/>
-              <w:left w:type="dxa" w:w="140"/>
-              <w:bottom w:type="dxa" w:w="140"/>
-              <w:right w:type="dxa" w:w="140"/>
-            </w:tcMar>
-          </w:tcPr>
-          <w:p>
-            <w:pPr>
-              <w:jc w:val="center"/>
-            </w:pPr>
-            <w:r>
-              <w:rPr>
-                <w:rFonts w:ascii="Segoe UI" w:cs="Segoe UI" w:eastAsia="Segoe UI" w:hAnsi="Segoe UI"/>
-                <w:b w:val="false"/>
-                <w:bCs w:val="false"/>
-                <w:color w:val="0F172A"/>
-                <w:sz w:val="17"/>
-                <w:szCs w:val="17"/>
-              </w:rPr>
-              <w:t xml:space="preserve">Pending (Needs 8-skill assignment)</w:t>
-            </w:r>
-          </w:p>
-        </w:tc>
-        <w:tc>
-          <w:tcPr>
-            <w:tcW w:type="pct" w:w="9%"/>
-            <w:tcBorders>
-              <w:top w:val="single" w:color="CBD5E1" w:sz="4"/>
-              <w:left w:val="single" w:color="CBD5E1" w:sz="4"/>
-              <w:bottom w:val="single" w:color="CBD5E1" w:sz="4"/>
-              <w:right w:val="single" w:color="CBD5E1" w:sz="4"/>
-            </w:tcBorders>
-            <w:shd w:fill="FEF3C7"/>
+              <w:t xml:space="preserve">Gold (20p Universal Declarative Engine with Capstone Spread &amp; Living Timeline)</w:t>
+            </w:r>
+          </w:p>
+        </w:tc>
+        <w:tc>
+          <w:tcPr>
+            <w:tcW w:type="pct" w:w="9%"/>
+            <w:tcBorders>
+              <w:top w:val="single" w:color="CBD5E1" w:sz="4"/>
+              <w:left w:val="single" w:color="CBD5E1" w:sz="4"/>
+              <w:bottom w:val="single" w:color="CBD5E1" w:sz="4"/>
+              <w:right w:val="single" w:color="CBD5E1" w:sz="4"/>
+            </w:tcBorders>
+            <w:shd w:fill="F8FAFC"/>
+            <w:tcMar>
+              <w:top w:type="dxa" w:w="140"/>
+              <w:left w:type="dxa" w:w="140"/>
+              <w:bottom w:type="dxa" w:w="140"/>
+              <w:right w:type="dxa" w:w="140"/>
+            </w:tcMar>
+          </w:tcPr>
+          <w:p>
+            <w:pPr>
+              <w:jc w:val="center"/>
+            </w:pPr>
+            <w:r>
+              <w:rPr>
+                <w:rFonts w:ascii="Segoe UI" w:cs="Segoe UI" w:eastAsia="Segoe UI" w:hAnsi="Segoe UI"/>
+                <w:b w:val="false"/>
+                <w:bCs w:val="false"/>
+                <w:color w:val="0F172A"/>
+                <w:sz w:val="17"/>
+                <w:szCs w:val="17"/>
+              </w:rPr>
+              <w:t xml:space="preserve">Mapped (4 Strands on Cover &amp; SOW)</w:t>
+            </w:r>
+          </w:p>
+        </w:tc>
+        <w:tc>
+          <w:tcPr>
+            <w:tcW w:type="pct" w:w="9%"/>
+            <w:tcBorders>
+              <w:top w:val="single" w:color="CBD5E1" w:sz="4"/>
+              <w:left w:val="single" w:color="CBD5E1" w:sz="4"/>
+              <w:bottom w:val="single" w:color="CBD5E1" w:sz="4"/>
+              <w:right w:val="single" w:color="CBD5E1" w:sz="4"/>
+            </w:tcBorders>
+            <w:shd w:fill="F8FAFC"/>
+            <w:tcMar>
+              <w:top w:type="dxa" w:w="140"/>
+              <w:left w:type="dxa" w:w="140"/>
+              <w:bottom w:type="dxa" w:w="140"/>
+              <w:right w:type="dxa" w:w="140"/>
+            </w:tcMar>
+          </w:tcPr>
+          <w:p>
+            <w:pPr>
+              <w:jc w:val="center"/>
+            </w:pPr>
+            <w:r>
+              <w:rPr>
+                <w:rFonts w:ascii="Segoe UI" w:cs="Segoe UI" w:eastAsia="Segoe UI" w:hAnsi="Segoe UI"/>
+                <w:b w:val="false"/>
+                <w:bCs w:val="false"/>
+                <w:color w:val="0F172A"/>
+                <w:sz w:val="17"/>
+                <w:szCs w:val="17"/>
+              </w:rPr>
+              <w:t xml:space="preserve">Active (7-Disciplinary Skill Cycle)</w:t>
+            </w:r>
+          </w:p>
+        </w:tc>
+        <w:tc>
+          <w:tcPr>
+            <w:tcW w:type="pct" w:w="9%"/>
+            <w:tcBorders>
+              <w:top w:val="single" w:color="CBD5E1" w:sz="4"/>
+              <w:left w:val="single" w:color="CBD5E1" w:sz="4"/>
+              <w:bottom w:val="single" w:color="CBD5E1" w:sz="4"/>
+              <w:right w:val="single" w:color="CBD5E1" w:sz="4"/>
+            </w:tcBorders>
+            <w:shd w:fill="DCFCE7"/>
             <w:tcMar>
               <w:top w:type="dxa" w:w="140"/>
               <w:left w:type="dxa" w:w="140"/>
@@ -3480,11 +3480,11 @@
                 <w:rFonts w:ascii="Segoe UI" w:cs="Segoe UI" w:eastAsia="Segoe UI" w:hAnsi="Segoe UI"/>
                 <w:b/>
                 <w:bCs/>
-                <w:color w:val="92400E"/>
-                <w:sz w:val="17"/>
-                <w:szCs w:val="17"/>
-              </w:rPr>
-              <w:t xml:space="preserve">KS3 PRIORITY #1</w:t>
+                <w:color w:val="166534"/>
+                <w:sz w:val="17"/>
+                <w:szCs w:val="17"/>
+              </w:rPr>
+              <w:t xml:space="preserve">100% GOLD</w:t>
             </w:r>
           </w:p>
         </w:tc>
@@ -3518,7 +3518,7 @@
                 <w:sz w:val="16"/>
                 <w:szCs w:val="16"/>
               </w:rPr>
-              <w:t xml:space="preserve">Top KS3 Target: Run scripts/generate_ks3_workbook.cjs to compile 20p workbook before class printing.</w:t>
+              <w:t xml:space="preserve">Production Ready. 20p Universal Engine workbook verified with 0px overflow and synced to Drive.</w:t>
             </w:r>
           </w:p>
         </w:tc>

</xml_diff>

<commit_message>
feat(eee): consolidate Early Elizabethan England into 3 unified 16-page double-page workbooks matching cme_new flagship specification
</commit_message>
<xml_diff>
--- a/public/docs/History_Curriculum_Master_Roadmap_16_Units.docx
+++ b/public/docs/History_Curriculum_Master_Roadmap_16_Units.docx
@@ -45,7 +45,7 @@
           <w:sz w:val="18"/>
           <w:szCs w:val="18"/>
         </w:rPr>
-        <w:t xml:space="preserve">🌟 4 Finished Master Gold Standards: </w:t>
+        <w:t xml:space="preserve">🌟 6 Finished Master Gold Standards: </w:t>
       </w:r>
       <w:r>
         <w:rPr>
@@ -54,7 +54,7 @@
           <w:sz w:val="18"/>
           <w:szCs w:val="18"/>
         </w:rPr>
-        <w:t xml:space="preserve">Medicine in Britain (GCSE), Conflict in the Middle East (GCSE), Industrialisation &amp; Empire (KS3), and The Early Modern World (KS3).
+        <w:t xml:space="preserve">Medicine in Britain (GCSE), Conflict in the Middle East (GCSE), Early Elizabethan England (GCSE), Industrialisation &amp; Empire (KS3), The Early Modern World (KS3), and The Great War: Western Front (KS3).
 </w:t>
       </w:r>
       <w:r>
@@ -96,7 +96,7 @@
           <w:sz w:val="18"/>
           <w:szCs w:val="18"/>
         </w:rPr>
-        <w:t xml:space="preserve">KS3 Target: Compile Great War Part 2 (Western Front) into the 20p Universal Engine. • GCSE Target: Consolidate Early Elizabethan England into 16p master booklets.</w:t>
+        <w:t xml:space="preserve">KS3 Target: Medieval England 20p Universal Double-Page migration. • GCSE Target: Weimar and Nazi Germany 4-4-4-4 Visual Revision Guide authoring.</w:t>
       </w:r>
     </w:p>
     <w:tbl>
@@ -3005,7 +3005,7 @@
                 <w:sz w:val="17"/>
                 <w:szCs w:val="17"/>
               </w:rPr>
-              <w:t xml:space="preserve">Amber (22 Sub-topics Authored)</w:t>
+              <w:t xml:space="preserve">Complete (3 Key Topics / 12 Enquiries)</w:t>
             </w:r>
           </w:p>
         </w:tc>
@@ -3039,7 +3039,7 @@
                 <w:sz w:val="17"/>
                 <w:szCs w:val="17"/>
               </w:rPr>
-              <w:t xml:space="preserve">Amber (Split across 3 KT Booklets)</w:t>
+              <w:t xml:space="preserve">Gold (3 KT Companion Textbooks)</w:t>
             </w:r>
           </w:p>
         </w:tc>
@@ -3073,88 +3073,88 @@
                 <w:sz w:val="17"/>
                 <w:szCs w:val="17"/>
               </w:rPr>
-              <w:t xml:space="preserve">Amber (Split across 3 KT Booklets)</w:t>
-            </w:r>
-          </w:p>
-        </w:tc>
-        <w:tc>
-          <w:tcPr>
-            <w:tcW w:type="pct" w:w="9%"/>
-            <w:tcBorders>
-              <w:top w:val="single" w:color="CBD5E1" w:sz="4"/>
-              <w:left w:val="single" w:color="CBD5E1" w:sz="4"/>
-              <w:bottom w:val="single" w:color="CBD5E1" w:sz="4"/>
-              <w:right w:val="single" w:color="CBD5E1" w:sz="4"/>
-            </w:tcBorders>
-            <w:shd w:fill="FFFFFF"/>
-            <w:tcMar>
-              <w:top w:type="dxa" w:w="140"/>
-              <w:left w:type="dxa" w:w="140"/>
-              <w:bottom w:type="dxa" w:w="140"/>
-              <w:right w:type="dxa" w:w="140"/>
-            </w:tcMar>
-          </w:tcPr>
-          <w:p>
-            <w:pPr>
-              <w:jc w:val="center"/>
-            </w:pPr>
-            <w:r>
-              <w:rPr>
-                <w:rFonts w:ascii="Segoe UI" w:cs="Segoe UI" w:eastAsia="Segoe UI" w:hAnsi="Segoe UI"/>
-                <w:b w:val="false"/>
-                <w:bCs w:val="false"/>
-                <w:color w:val="0F172A"/>
-                <w:sz w:val="17"/>
-                <w:szCs w:val="17"/>
-              </w:rPr>
-              <w:t xml:space="preserve">Partial</w:t>
-            </w:r>
-          </w:p>
-        </w:tc>
-        <w:tc>
-          <w:tcPr>
-            <w:tcW w:type="pct" w:w="9%"/>
-            <w:tcBorders>
-              <w:top w:val="single" w:color="CBD5E1" w:sz="4"/>
-              <w:left w:val="single" w:color="CBD5E1" w:sz="4"/>
-              <w:bottom w:val="single" w:color="CBD5E1" w:sz="4"/>
-              <w:right w:val="single" w:color="CBD5E1" w:sz="4"/>
-            </w:tcBorders>
-            <w:shd w:fill="FFFFFF"/>
-            <w:tcMar>
-              <w:top w:type="dxa" w:w="140"/>
-              <w:left w:type="dxa" w:w="140"/>
-              <w:bottom w:type="dxa" w:w="140"/>
-              <w:right w:type="dxa" w:w="140"/>
-            </w:tcMar>
-          </w:tcPr>
-          <w:p>
-            <w:pPr>
-              <w:jc w:val="center"/>
-            </w:pPr>
-            <w:r>
-              <w:rPr>
-                <w:rFonts w:ascii="Segoe UI" w:cs="Segoe UI" w:eastAsia="Segoe UI" w:hAnsi="Segoe UI"/>
-                <w:b w:val="false"/>
-                <w:bCs w:val="false"/>
-                <w:color w:val="0F172A"/>
-                <w:sz w:val="17"/>
-                <w:szCs w:val="17"/>
-              </w:rPr>
-              <w:t xml:space="preserve">Partial</w:t>
-            </w:r>
-          </w:p>
-        </w:tc>
-        <w:tc>
-          <w:tcPr>
-            <w:tcW w:type="pct" w:w="9%"/>
-            <w:tcBorders>
-              <w:top w:val="single" w:color="CBD5E1" w:sz="4"/>
-              <w:left w:val="single" w:color="CBD5E1" w:sz="4"/>
-              <w:bottom w:val="single" w:color="CBD5E1" w:sz="4"/>
-              <w:right w:val="single" w:color="CBD5E1" w:sz="4"/>
-            </w:tcBorders>
-            <w:shd w:fill="FEE2E2"/>
+              <w:t xml:space="preserve">Gold (3x 16p Double-Page Booklets KT1–3)</w:t>
+            </w:r>
+          </w:p>
+        </w:tc>
+        <w:tc>
+          <w:tcPr>
+            <w:tcW w:type="pct" w:w="9%"/>
+            <w:tcBorders>
+              <w:top w:val="single" w:color="CBD5E1" w:sz="4"/>
+              <w:left w:val="single" w:color="CBD5E1" w:sz="4"/>
+              <w:bottom w:val="single" w:color="CBD5E1" w:sz="4"/>
+              <w:right w:val="single" w:color="CBD5E1" w:sz="4"/>
+            </w:tcBorders>
+            <w:shd w:fill="FFFFFF"/>
+            <w:tcMar>
+              <w:top w:type="dxa" w:w="140"/>
+              <w:left w:type="dxa" w:w="140"/>
+              <w:bottom w:type="dxa" w:w="140"/>
+              <w:right w:type="dxa" w:w="140"/>
+            </w:tcMar>
+          </w:tcPr>
+          <w:p>
+            <w:pPr>
+              <w:jc w:val="center"/>
+            </w:pPr>
+            <w:r>
+              <w:rPr>
+                <w:rFonts w:ascii="Segoe UI" w:cs="Segoe UI" w:eastAsia="Segoe UI" w:hAnsi="Segoe UI"/>
+                <w:b w:val="false"/>
+                <w:bCs w:val="false"/>
+                <w:color w:val="0F172A"/>
+                <w:sz w:val="17"/>
+                <w:szCs w:val="17"/>
+              </w:rPr>
+              <w:t xml:space="preserve">Mapped (Government, Religion, Conflict, Society)</w:t>
+            </w:r>
+          </w:p>
+        </w:tc>
+        <w:tc>
+          <w:tcPr>
+            <w:tcW w:type="pct" w:w="9%"/>
+            <w:tcBorders>
+              <w:top w:val="single" w:color="CBD5E1" w:sz="4"/>
+              <w:left w:val="single" w:color="CBD5E1" w:sz="4"/>
+              <w:bottom w:val="single" w:color="CBD5E1" w:sz="4"/>
+              <w:right w:val="single" w:color="CBD5E1" w:sz="4"/>
+            </w:tcBorders>
+            <w:shd w:fill="FFFFFF"/>
+            <w:tcMar>
+              <w:top w:type="dxa" w:w="140"/>
+              <w:left w:type="dxa" w:w="140"/>
+              <w:bottom w:type="dxa" w:w="140"/>
+              <w:right w:type="dxa" w:w="140"/>
+            </w:tcMar>
+          </w:tcPr>
+          <w:p>
+            <w:pPr>
+              <w:jc w:val="center"/>
+            </w:pPr>
+            <w:r>
+              <w:rPr>
+                <w:rFonts w:ascii="Segoe UI" w:cs="Segoe UI" w:eastAsia="Segoe UI" w:hAnsi="Segoe UI"/>
+                <w:b w:val="false"/>
+                <w:bCs w:val="false"/>
+                <w:color w:val="0F172A"/>
+                <w:sz w:val="17"/>
+                <w:szCs w:val="17"/>
+              </w:rPr>
+              <w:t xml:space="preserve">Active (Q1 Features, Q2 Explain Why, Q3 Essay)</w:t>
+            </w:r>
+          </w:p>
+        </w:tc>
+        <w:tc>
+          <w:tcPr>
+            <w:tcW w:type="pct" w:w="9%"/>
+            <w:tcBorders>
+              <w:top w:val="single" w:color="CBD5E1" w:sz="4"/>
+              <w:left w:val="single" w:color="CBD5E1" w:sz="4"/>
+              <w:bottom w:val="single" w:color="CBD5E1" w:sz="4"/>
+              <w:right w:val="single" w:color="CBD5E1" w:sz="4"/>
+            </w:tcBorders>
+            <w:shd w:fill="DCFCE7"/>
             <w:tcMar>
               <w:top w:type="dxa" w:w="140"/>
               <w:left w:type="dxa" w:w="140"/>
@@ -3171,11 +3171,11 @@
                 <w:rFonts w:ascii="Segoe UI" w:cs="Segoe UI" w:eastAsia="Segoe UI" w:hAnsi="Segoe UI"/>
                 <w:b/>
                 <w:bCs/>
-                <w:color w:val="991B1B"/>
-                <w:sz w:val="17"/>
-                <w:szCs w:val="17"/>
-              </w:rPr>
-              <w:t xml:space="preserve">GCSE PRIORITY #1</w:t>
+                <w:color w:val="166534"/>
+                <w:sz w:val="17"/>
+                <w:szCs w:val="17"/>
+              </w:rPr>
+              <w:t xml:space="preserve">100% GOLD</w:t>
             </w:r>
           </w:p>
         </w:tc>
@@ -3209,7 +3209,7 @@
                 <w:sz w:val="16"/>
                 <w:szCs w:val="16"/>
               </w:rPr>
-              <w:t xml:space="preserve">Top GCSE Target: Consolidate into 3 unified 16-page double-page booklets matching cme_new.</w:t>
+              <w:t xml:space="preserve">Complete &amp; Production Ready. All 3 Key Topics consolidated into unified 16-page double-page booklets matching cme_new.</w:t>
             </w:r>
           </w:p>
         </w:tc>

</xml_diff>

<commit_message>
docs(roadmap): update Early Elizabethan England status to reflect textbook overhaul requirement
</commit_message>
<xml_diff>
--- a/public/docs/History_Curriculum_Master_Roadmap_16_Units.docx
+++ b/public/docs/History_Curriculum_Master_Roadmap_16_Units.docx
@@ -45,7 +45,7 @@
           <w:sz w:val="18"/>
           <w:szCs w:val="18"/>
         </w:rPr>
-        <w:t xml:space="preserve">🌟 7 Finished Master Gold Standards: </w:t>
+        <w:t xml:space="preserve">🌟 6 Finished Master Gold Standards: </w:t>
       </w:r>
       <w:r>
         <w:rPr>
@@ -54,7 +54,7 @@
           <w:sz w:val="18"/>
           <w:szCs w:val="18"/>
         </w:rPr>
-        <w:t xml:space="preserve">Medicine in Britain (GCSE), Conflict in the Middle East (GCSE), Early Elizabethan England (GCSE), Weimar and Nazi Germany (GCSE), Industrialisation &amp; Empire (KS3), The Early Modern World (KS3), and The Great War: Western Front (KS3).
+        <w:t xml:space="preserve">Medicine in Britain (GCSE), Conflict in the Middle East (GCSE), Weimar and Nazi Germany (GCSE), Industrialisation &amp; Empire (KS3), The Early Modern World (KS3), and The Great War: Western Front (KS3).
 </w:t>
       </w:r>
       <w:r>
@@ -87,7 +87,7 @@
           <w:sz w:val="18"/>
           <w:szCs w:val="18"/>
         </w:rPr>
-        <w:t xml:space="preserve">🎯 Immediate Next Priority Action: </w:t>
+        <w:t xml:space="preserve">🎯 Immediate Next Priority Actions: </w:t>
       </w:r>
       <w:r>
         <w:rPr>
@@ -96,7 +96,8 @@
           <w:sz w:val="18"/>
           <w:szCs w:val="18"/>
         </w:rPr>
-        <w:t xml:space="preserve">Top Departmental Target: Year 7 Medieval England &amp; Power (1066–1485) 20-Page Universal Double-Page migration &amp; 8 core enquiries refactor. All GCSE Edexcel units are now 100% Complete &amp; Production Ready.</w:t>
+        <w:t xml:space="preserve">1. Early Elizabethan England (eee): Workbooks are modern (3x 16p), but textbooks are legacy hybrid sheets with severe narrative gaps requiring a modern 12-page publisher-grade engine matching cme_new.
+2. Year 7 Medieval England &amp; Power (1066–1485): 20-Page Universal Double-Page migration &amp; 8 core enquiries refactor.</w:t>
       </w:r>
     </w:p>
     <w:tbl>
@@ -1803,7 +1804,7 @@
                 <w:sz w:val="17"/>
                 <w:szCs w:val="17"/>
               </w:rPr>
-              <w:t xml:space="preserve">Gold (Field Companion &amp; Parent Pack)</w:t>
+              <w:t xml:space="preserve">Gold (24p Master Field Companion Large Print A4)</w:t>
             </w:r>
           </w:p>
         </w:tc>
@@ -1973,7 +1974,7 @@
                 <w:sz w:val="16"/>
                 <w:szCs w:val="16"/>
               </w:rPr>
-              <w:t xml:space="preserve">Live Interactive Web Companion. Stable in production.</w:t>
+              <w:t xml:space="preserve">Single 24-page Master Field Companion (A4 Large Print, 0px overflow, 13 stops + poetry spreads) live &amp; synced to Department File.</w:t>
             </w:r>
           </w:p>
         </w:tc>
@@ -3039,7 +3040,7 @@
                 <w:sz w:val="17"/>
                 <w:szCs w:val="17"/>
               </w:rPr>
-              <w:t xml:space="preserve">Gold (3 KT Companion Textbooks)</w:t>
+              <w:t xml:space="preserve">Amber (Legacy Hybrid - Needs 12p Publisher Suite)</w:t>
             </w:r>
           </w:p>
         </w:tc>
@@ -3154,7 +3155,7 @@
               <w:bottom w:val="single" w:color="CBD5E1" w:sz="4"/>
               <w:right w:val="single" w:color="CBD5E1" w:sz="4"/>
             </w:tcBorders>
-            <w:shd w:fill="DCFCE7"/>
+            <w:shd w:fill="FEF3C7"/>
             <w:tcMar>
               <w:top w:type="dxa" w:w="140"/>
               <w:left w:type="dxa" w:w="140"/>
@@ -3171,11 +3172,11 @@
                 <w:rFonts w:ascii="Segoe UI" w:cs="Segoe UI" w:eastAsia="Segoe UI" w:hAnsi="Segoe UI"/>
                 <w:b/>
                 <w:bCs/>
-                <w:color w:val="166534"/>
-                <w:sz w:val="17"/>
-                <w:szCs w:val="17"/>
-              </w:rPr>
-              <w:t xml:space="preserve">100% GOLD</w:t>
+                <w:color w:val="92400E"/>
+                <w:sz w:val="17"/>
+                <w:szCs w:val="17"/>
+              </w:rPr>
+              <w:t xml:space="preserve">TEXTBOOK AUDIT REQ</w:t>
             </w:r>
           </w:p>
         </w:tc>
@@ -3209,7 +3210,7 @@
                 <w:sz w:val="16"/>
                 <w:szCs w:val="16"/>
               </w:rPr>
-              <w:t xml:space="preserve">Complete &amp; Production Ready. All 3 Key Topics consolidated into unified 16-page double-page booklets matching cme_new.</w:t>
+              <w:t xml:space="preserve">Workbooks modern (3x 16p), but textbooks currently use legacy hybrid sheets with severe narrative gaps across Plots, Dutch campaign, and Roanoke. Needs 12p publisher master textbook engine matching cme_new.</w:t>
             </w:r>
           </w:p>
         </w:tc>
@@ -5391,7 +5392,7 @@
           <w:sz w:val="16"/>
           <w:szCs w:val="16"/>
         </w:rPr>
-        <w:t xml:space="preserve">Generated: 26 September 2026 • The History Department Revision Hub • Synchronized with DEPARTMENTAL_ROADMAP.md</w:t>
+        <w:t xml:space="preserve">Generated: 27 September 2026 • The History Department Revision Hub • Synchronized with DEPARTMENTAL_ROADMAP.md</w:t>
       </w:r>
     </w:p>
     <w:sectPr>

</xml_diff>

<commit_message>
feat(eee): compile 12-page publisher-grade master textbooks for KT1, KT2, and KT3 with 0px overflow
</commit_message>
<xml_diff>
--- a/public/docs/History_Curriculum_Master_Roadmap_16_Units.docx
+++ b/public/docs/History_Curriculum_Master_Roadmap_16_Units.docx
@@ -3040,7 +3040,7 @@
                 <w:sz w:val="17"/>
                 <w:szCs w:val="17"/>
               </w:rPr>
-              <w:t xml:space="preserve">Amber (Legacy Hybrid - Needs 12p Publisher Suite)</w:t>
+              <w:t xml:space="preserve">Gold (3x 12p Publisher Suite KT1–3, 0px Overflow)</w:t>
             </w:r>
           </w:p>
         </w:tc>
@@ -3155,7 +3155,7 @@
               <w:bottom w:val="single" w:color="CBD5E1" w:sz="4"/>
               <w:right w:val="single" w:color="CBD5E1" w:sz="4"/>
             </w:tcBorders>
-            <w:shd w:fill="FEF3C7"/>
+            <w:shd w:fill="DCFCE7"/>
             <w:tcMar>
               <w:top w:type="dxa" w:w="140"/>
               <w:left w:type="dxa" w:w="140"/>
@@ -3172,11 +3172,11 @@
                 <w:rFonts w:ascii="Segoe UI" w:cs="Segoe UI" w:eastAsia="Segoe UI" w:hAnsi="Segoe UI"/>
                 <w:b/>
                 <w:bCs/>
-                <w:color w:val="92400E"/>
-                <w:sz w:val="17"/>
-                <w:szCs w:val="17"/>
-              </w:rPr>
-              <w:t xml:space="preserve">TEXTBOOK AUDIT REQ</w:t>
+                <w:color w:val="166534"/>
+                <w:sz w:val="17"/>
+                <w:szCs w:val="17"/>
+              </w:rPr>
+              <w:t xml:space="preserve">100% COMPLETE</w:t>
             </w:r>
           </w:p>
         </w:tc>
@@ -3210,7 +3210,7 @@
                 <w:sz w:val="16"/>
                 <w:szCs w:val="16"/>
               </w:rPr>
-              <w:t xml:space="preserve">Workbooks modern (3x 16p), but textbooks currently use legacy hybrid sheets with severe narrative gaps across Plots, Dutch campaign, and Roanoke. Needs 12p publisher master textbook engine matching cme_new.</w:t>
+              <w:t xml:space="preserve">Complete &amp; Production Ready. All 3 Key Topics feature 12-page publisher master textbooks grounded directly in Pearson specification prose with 0px overflow and synced to Department File.</w:t>
             </w:r>
           </w:p>
         </w:tc>

</xml_diff>